<commit_message>
Report v2.2: full-width figures in docx
Co-Authored-By: Claude Fable 5 <noreply@anthropic.com>
Claude-Session: https://claude.ai/code/session_01WN4xVnaym2GarLHXdV4jSW
</commit_message>
<xml_diff>
--- a/reports/c0_v2/DTC_RD03_C0v2_MeshConvergence_Report.docx
+++ b/reports/c0_v2/DTC_RD03_C0v2_MeshConvergence_Report.docx
@@ -3343,12 +3343,13 @@
     </w:p>
     <w:p>
       <w:pPr>
-        <w:spacing w:after="40" w:before="60"/>
+        <w:spacing w:after="40" w:before="80"/>
+        <w:jc w:val="center"/>
       </w:pPr>
       <w:r>
         <w:drawing>
           <wp:inline distT="0" distB="0" distL="0" distR="0">
-            <wp:extent cx="2952750" cy="1866900"/>
+            <wp:extent cx="6238875" cy="3952875"/>
             <wp:effectExtent t="0" r="0" b="0" l="0"/>
             <wp:docPr id="1" name="" descr="" title=""/>
             <wp:cNvGraphicFramePr>
@@ -3373,7 +3374,7 @@
                   <pic:spPr bwMode="auto">
                     <a:xfrm>
                       <a:off x="0" y="0"/>
-                      <a:ext cx="2952750" cy="1866900"/>
+                      <a:ext cx="6238875" cy="3952875"/>
                     </a:xfrm>
                     <a:prstGeom prst="rect">
                       <a:avLst/>
@@ -4690,12 +4691,13 @@
     </w:tbl>
     <w:p>
       <w:pPr>
-        <w:spacing w:after="40" w:before="60"/>
+        <w:spacing w:after="40" w:before="80"/>
+        <w:jc w:val="center"/>
       </w:pPr>
       <w:r>
         <w:drawing>
           <wp:inline distT="0" distB="0" distL="0" distR="0">
-            <wp:extent cx="2952750" cy="1866900"/>
+            <wp:extent cx="6238875" cy="3952875"/>
             <wp:effectExtent t="0" r="0" b="0" l="0"/>
             <wp:docPr id="1" name="" descr="" title=""/>
             <wp:cNvGraphicFramePr>
@@ -4720,7 +4722,7 @@
                   <pic:spPr bwMode="auto">
                     <a:xfrm>
                       <a:off x="0" y="0"/>
-                      <a:ext cx="2952750" cy="1866900"/>
+                      <a:ext cx="6238875" cy="3952875"/>
                     </a:xfrm>
                     <a:prstGeom prst="rect">
                       <a:avLst/>
@@ -5735,12 +5737,13 @@
     </w:p>
     <w:p>
       <w:pPr>
-        <w:spacing w:after="40" w:before="60"/>
+        <w:spacing w:after="40" w:before="80"/>
+        <w:jc w:val="center"/>
       </w:pPr>
       <w:r>
         <w:drawing>
           <wp:inline distT="0" distB="0" distL="0" distR="0">
-            <wp:extent cx="2952750" cy="1866900"/>
+            <wp:extent cx="6238875" cy="3952875"/>
             <wp:effectExtent t="0" r="0" b="0" l="0"/>
             <wp:docPr id="1" name="" descr="" title=""/>
             <wp:cNvGraphicFramePr>
@@ -5765,7 +5768,7 @@
                   <pic:spPr bwMode="auto">
                     <a:xfrm>
                       <a:off x="0" y="0"/>
-                      <a:ext cx="2952750" cy="1866900"/>
+                      <a:ext cx="6238875" cy="3952875"/>
                     </a:xfrm>
                     <a:prstGeom prst="rect">
                       <a:avLst/>
@@ -5796,12 +5799,13 @@
     </w:p>
     <w:p>
       <w:pPr>
-        <w:spacing w:after="40" w:before="60"/>
+        <w:spacing w:after="40" w:before="80"/>
+        <w:jc w:val="center"/>
       </w:pPr>
       <w:r>
         <w:drawing>
           <wp:inline distT="0" distB="0" distL="0" distR="0">
-            <wp:extent cx="2952750" cy="1866900"/>
+            <wp:extent cx="6238875" cy="3952875"/>
             <wp:effectExtent t="0" r="0" b="0" l="0"/>
             <wp:docPr id="1" name="" descr="" title=""/>
             <wp:cNvGraphicFramePr>
@@ -5826,7 +5830,7 @@
                   <pic:spPr bwMode="auto">
                     <a:xfrm>
                       <a:off x="0" y="0"/>
-                      <a:ext cx="2952750" cy="1866900"/>
+                      <a:ext cx="6238875" cy="3952875"/>
                     </a:xfrm>
                     <a:prstGeom prst="rect">
                       <a:avLst/>
@@ -5888,12 +5892,13 @@
     </w:p>
     <w:p>
       <w:pPr>
-        <w:spacing w:after="40" w:before="60"/>
+        <w:spacing w:after="40" w:before="80"/>
+        <w:jc w:val="center"/>
       </w:pPr>
       <w:r>
         <w:drawing>
           <wp:inline distT="0" distB="0" distL="0" distR="0">
-            <wp:extent cx="2952750" cy="1866900"/>
+            <wp:extent cx="6238875" cy="3952875"/>
             <wp:effectExtent t="0" r="0" b="0" l="0"/>
             <wp:docPr id="1" name="" descr="" title=""/>
             <wp:cNvGraphicFramePr>
@@ -5918,7 +5923,7 @@
                   <pic:spPr bwMode="auto">
                     <a:xfrm>
                       <a:off x="0" y="0"/>
-                      <a:ext cx="2952750" cy="1866900"/>
+                      <a:ext cx="6238875" cy="3952875"/>
                     </a:xfrm>
                     <a:prstGeom prst="rect">
                       <a:avLst/>
@@ -6455,12 +6460,13 @@
     </w:tbl>
     <w:p>
       <w:pPr>
-        <w:spacing w:after="40" w:before="60"/>
+        <w:spacing w:after="40" w:before="80"/>
+        <w:jc w:val="center"/>
       </w:pPr>
       <w:r>
         <w:drawing>
           <wp:inline distT="0" distB="0" distL="0" distR="0">
-            <wp:extent cx="2952750" cy="1866900"/>
+            <wp:extent cx="6238875" cy="3952875"/>
             <wp:effectExtent t="0" r="0" b="0" l="0"/>
             <wp:docPr id="1" name="" descr="" title=""/>
             <wp:cNvGraphicFramePr>
@@ -6485,7 +6491,7 @@
                   <pic:spPr bwMode="auto">
                     <a:xfrm>
                       <a:off x="0" y="0"/>
-                      <a:ext cx="2952750" cy="1866900"/>
+                      <a:ext cx="6238875" cy="3952875"/>
                     </a:xfrm>
                     <a:prstGeom prst="rect">
                       <a:avLst/>
@@ -7126,12 +7132,13 @@
     </w:p>
     <w:p>
       <w:pPr>
-        <w:spacing w:after="40" w:before="60"/>
+        <w:spacing w:after="40" w:before="80"/>
+        <w:jc w:val="center"/>
       </w:pPr>
       <w:r>
         <w:drawing>
           <wp:inline distT="0" distB="0" distL="0" distR="0">
-            <wp:extent cx="2952750" cy="1866900"/>
+            <wp:extent cx="6238875" cy="3952875"/>
             <wp:effectExtent t="0" r="0" b="0" l="0"/>
             <wp:docPr id="1" name="" descr="" title=""/>
             <wp:cNvGraphicFramePr>
@@ -7156,7 +7163,7 @@
                   <pic:spPr bwMode="auto">
                     <a:xfrm>
                       <a:off x="0" y="0"/>
-                      <a:ext cx="2952750" cy="1866900"/>
+                      <a:ext cx="6238875" cy="3952875"/>
                     </a:xfrm>
                     <a:prstGeom prst="rect">
                       <a:avLst/>
@@ -7204,12 +7211,13 @@
     </w:p>
     <w:p>
       <w:pPr>
-        <w:spacing w:after="40" w:before="60"/>
+        <w:spacing w:after="40" w:before="80"/>
+        <w:jc w:val="center"/>
       </w:pPr>
       <w:r>
         <w:drawing>
           <wp:inline distT="0" distB="0" distL="0" distR="0">
-            <wp:extent cx="2952750" cy="1971675"/>
+            <wp:extent cx="6238875" cy="4162425"/>
             <wp:effectExtent t="0" r="0" b="0" l="0"/>
             <wp:docPr id="1" name="" descr="" title=""/>
             <wp:cNvGraphicFramePr>
@@ -7234,7 +7242,7 @@
                   <pic:spPr bwMode="auto">
                     <a:xfrm>
                       <a:off x="0" y="0"/>
-                      <a:ext cx="2952750" cy="1971675"/>
+                      <a:ext cx="6238875" cy="4162425"/>
                     </a:xfrm>
                     <a:prstGeom prst="rect">
                       <a:avLst/>
@@ -7265,12 +7273,13 @@
     </w:p>
     <w:p>
       <w:pPr>
-        <w:spacing w:after="40" w:before="60"/>
+        <w:spacing w:after="40" w:before="80"/>
+        <w:jc w:val="center"/>
       </w:pPr>
       <w:r>
         <w:drawing>
           <wp:inline distT="0" distB="0" distL="0" distR="0">
-            <wp:extent cx="2952750" cy="1971675"/>
+            <wp:extent cx="6238875" cy="4162425"/>
             <wp:effectExtent t="0" r="0" b="0" l="0"/>
             <wp:docPr id="1" name="" descr="" title=""/>
             <wp:cNvGraphicFramePr>
@@ -7295,7 +7304,7 @@
                   <pic:spPr bwMode="auto">
                     <a:xfrm>
                       <a:off x="0" y="0"/>
-                      <a:ext cx="2952750" cy="1971675"/>
+                      <a:ext cx="6238875" cy="4162425"/>
                     </a:xfrm>
                     <a:prstGeom prst="rect">
                       <a:avLst/>
@@ -7326,12 +7335,13 @@
     </w:p>
     <w:p>
       <w:pPr>
-        <w:spacing w:after="40" w:before="60"/>
+        <w:spacing w:after="40" w:before="80"/>
+        <w:jc w:val="center"/>
       </w:pPr>
       <w:r>
         <w:drawing>
           <wp:inline distT="0" distB="0" distL="0" distR="0">
-            <wp:extent cx="2952750" cy="1971675"/>
+            <wp:extent cx="6238875" cy="4162425"/>
             <wp:effectExtent t="0" r="0" b="0" l="0"/>
             <wp:docPr id="1" name="" descr="" title=""/>
             <wp:cNvGraphicFramePr>
@@ -7356,7 +7366,7 @@
                   <pic:spPr bwMode="auto">
                     <a:xfrm>
                       <a:off x="0" y="0"/>
-                      <a:ext cx="2952750" cy="1971675"/>
+                      <a:ext cx="6238875" cy="4162425"/>
                     </a:xfrm>
                     <a:prstGeom prst="rect">
                       <a:avLst/>
@@ -7387,12 +7397,13 @@
     </w:p>
     <w:p>
       <w:pPr>
-        <w:spacing w:after="40" w:before="60"/>
+        <w:spacing w:after="40" w:before="80"/>
+        <w:jc w:val="center"/>
       </w:pPr>
       <w:r>
         <w:drawing>
           <wp:inline distT="0" distB="0" distL="0" distR="0">
-            <wp:extent cx="2952750" cy="1971675"/>
+            <wp:extent cx="6238875" cy="4162425"/>
             <wp:effectExtent t="0" r="0" b="0" l="0"/>
             <wp:docPr id="1" name="" descr="" title=""/>
             <wp:cNvGraphicFramePr>
@@ -7417,7 +7428,7 @@
                   <pic:spPr bwMode="auto">
                     <a:xfrm>
                       <a:off x="0" y="0"/>
-                      <a:ext cx="2952750" cy="1971675"/>
+                      <a:ext cx="6238875" cy="4162425"/>
                     </a:xfrm>
                     <a:prstGeom prst="rect">
                       <a:avLst/>

</xml_diff>